<commit_message>
update of simulator and quiz
using MINST dataset to simulator and fine tuned quiz answers
</commit_message>
<xml_diff>
--- a/quiz_with_rationale.docx
+++ b/quiz_with_rationale.docx
@@ -86,7 +86,25 @@
             <w:iCs/>
             <w:lang w:val="en-US"/>
           </w:rPr>
-          <w:t>t Quiz Results</w:t>
+          <w:t>t Q</w:t>
+        </w:r>
+        <w:r>
+          <w:rPr>
+            <w:rStyle w:val="Hyperlink"/>
+            <w:i/>
+            <w:iCs/>
+            <w:lang w:val="en-US"/>
+          </w:rPr>
+          <w:t>u</w:t>
+        </w:r>
+        <w:r>
+          <w:rPr>
+            <w:rStyle w:val="Hyperlink"/>
+            <w:i/>
+            <w:iCs/>
+            <w:lang w:val="en-US"/>
+          </w:rPr>
+          <w:t>iz Results</w:t>
         </w:r>
       </w:hyperlink>
     </w:p>
@@ -144,7 +162,27 @@
         <w:rPr>
           <w:lang w:val="en-US"/>
         </w:rPr>
-        <w:t>2 questions contain multiple choice answers</w:t>
+        <w:t>1</w:t>
+      </w:r>
+      <w:r>
+        <w:rPr>
+          <w:lang w:val="en-US"/>
+        </w:rPr>
+        <w:t xml:space="preserve"> </w:t>
+      </w:r>
+      <w:proofErr w:type="gramStart"/>
+      <w:r>
+        <w:rPr>
+          <w:lang w:val="en-US"/>
+        </w:rPr>
+        <w:t>questions</w:t>
+      </w:r>
+      <w:proofErr w:type="gramEnd"/>
+      <w:r>
+        <w:rPr>
+          <w:lang w:val="en-US"/>
+        </w:rPr>
+        <w:t xml:space="preserve"> contain multiple choice answers</w:t>
       </w:r>
     </w:p>
     <w:p>
@@ -162,7 +200,13 @@
         <w:rPr>
           <w:lang w:val="en-US"/>
         </w:rPr>
-        <w:t>8 questions contain only one right answer</w:t>
+        <w:t>9</w:t>
+      </w:r>
+      <w:r>
+        <w:rPr>
+          <w:lang w:val="en-US"/>
+        </w:rPr>
+        <w:t xml:space="preserve"> questions contain only one right answer</w:t>
       </w:r>
     </w:p>
     <w:p>
@@ -673,6 +717,12 @@
         </w:rPr>
         <w:tab/>
         <w:t>Feedback:</w:t>
+      </w:r>
+      <w:r>
+        <w:rPr>
+          <w:lang w:val="en-US"/>
+        </w:rPr>
+        <w:t xml:space="preserve"> This total score does not represent element-wise multiplication</w:t>
       </w:r>
     </w:p>
     <w:p>
@@ -7246,8 +7296,29 @@
         <w:rPr>
           <w:lang w:val="en-US"/>
         </w:rPr>
-        <w:t>[one correct answer]</w:t>
-      </w:r>
+        <w:t>[one correct answer</w:t>
+      </w:r>
+      <w:proofErr w:type="gramStart"/>
+      <w:r>
+        <w:rPr>
+          <w:lang w:val="en-US"/>
+        </w:rPr>
+        <w:t>]</w:t>
+      </w:r>
+      <w:r>
+        <w:rPr>
+          <w:lang w:val="en-US"/>
+        </w:rPr>
+        <w:t xml:space="preserve"> </w:t>
+      </w:r>
+      <w:r>
+        <w:rPr>
+          <w:color w:val="EE0000"/>
+          <w:lang w:val="en-US"/>
+        </w:rPr>
+        <w:t>??</w:t>
+      </w:r>
+      <w:proofErr w:type="gramEnd"/>
     </w:p>
     <w:p>
       <w:pPr>
@@ -7341,7 +7412,7 @@
         <w:rPr>
           <w:lang w:val="en-US"/>
         </w:rPr>
-        <w:t>correct/ incorrect]</w:t>
+        <w:t>incorrect]</w:t>
       </w:r>
     </w:p>
     <w:p>
@@ -7454,7 +7525,7 @@
         <w:rPr>
           <w:lang w:val="en-US"/>
         </w:rPr>
-        <w:t>correct/ incorrect]</w:t>
+        <w:t>incorrect]</w:t>
       </w:r>
     </w:p>
     <w:p>
@@ -7521,163 +7592,296 @@
           <w:lang w:val="en-US"/>
         </w:rPr>
         <w:tab/>
+        <w:t>Feedback</w:t>
+      </w:r>
+      <w:proofErr w:type="gramStart"/>
+      <w:r>
+        <w:rPr>
+          <w:lang w:val="en-US"/>
+        </w:rPr>
+        <w:t>:</w:t>
+      </w:r>
+      <w:r>
+        <w:rPr>
+          <w:lang w:val="en-US"/>
+        </w:rPr>
+        <w:t xml:space="preserve"> ???</w:t>
+      </w:r>
+      <w:proofErr w:type="gramEnd"/>
+    </w:p>
+    <w:p>
+      <w:pPr>
+        <w:spacing w:line="240" w:lineRule="auto"/>
+        <w:rPr>
+          <w:lang w:val="en-US"/>
+        </w:rPr>
+      </w:pPr>
+    </w:p>
+    <w:p>
+      <w:pPr>
+        <w:spacing w:line="240" w:lineRule="auto"/>
+        <w:rPr>
+          <w:lang w:val="en-US"/>
+        </w:rPr>
+      </w:pPr>
+      <w:r>
+        <w:rPr>
+          <w:lang w:val="en-US"/>
+        </w:rPr>
+        <w:tab/>
+      </w:r>
+      <w:r>
+        <w:rPr>
+          <w:rStyle w:val="BookTitle"/>
+          <w:lang w:val="en-US"/>
+        </w:rPr>
+        <w:t xml:space="preserve">Answer </w:t>
+      </w:r>
+      <w:r>
+        <w:rPr>
+          <w:rStyle w:val="BookTitle"/>
+          <w:lang w:val="en-US"/>
+        </w:rPr>
+        <w:t>C</w:t>
+      </w:r>
+      <w:proofErr w:type="gramStart"/>
+      <w:r>
+        <w:rPr>
+          <w:rStyle w:val="BookTitle"/>
+          <w:lang w:val="en-US"/>
+        </w:rPr>
+        <w:t>:</w:t>
+      </w:r>
+      <w:r>
+        <w:rPr>
+          <w:lang w:val="en-US"/>
+        </w:rPr>
+        <w:t xml:space="preserve">  [</w:t>
+      </w:r>
+      <w:proofErr w:type="gramEnd"/>
+      <w:r>
+        <w:rPr>
+          <w:lang w:val="en-US"/>
+        </w:rPr>
+        <w:t>correct]</w:t>
+      </w:r>
+    </w:p>
+    <w:p>
+      <w:pPr>
+        <w:spacing w:line="240" w:lineRule="auto"/>
+        <w:rPr>
+          <w:lang w:val="en-US"/>
+        </w:rPr>
+      </w:pPr>
+      <w:r>
+        <w:rPr>
+          <w:lang w:val="en-US"/>
+        </w:rPr>
+        <w:tab/>
+      </w:r>
+      <w:r>
+        <w:rPr>
+          <w:lang w:val="en-US"/>
+        </w:rPr>
+        <w:tab/>
+      </w:r>
+      <w:r>
+        <w:rPr>
+          <w:lang w:val="en-US"/>
+        </w:rPr>
+        <w:tab/>
+      </w:r>
+      <w:proofErr w:type="gramStart"/>
+      <w:r>
+        <w:rPr>
+          <w:lang w:val="en-US"/>
+        </w:rPr>
+        <w:t>[ ]</w:t>
+      </w:r>
+      <w:proofErr w:type="gramEnd"/>
+      <w:r>
+        <w:rPr>
+          <w:lang w:val="en-US"/>
+        </w:rPr>
+        <w:t xml:space="preserve"> ERF typical starts small and grows during the learning cycles</w:t>
+      </w:r>
+    </w:p>
+    <w:p>
+      <w:pPr>
+        <w:spacing w:line="240" w:lineRule="auto"/>
+        <w:ind w:left="2127"/>
+        <w:rPr>
+          <w:lang w:val="en-US"/>
+        </w:rPr>
+      </w:pPr>
+      <w:r>
+        <w:rPr>
+          <w:lang w:val="en-US"/>
+        </w:rPr>
+        <w:tab/>
+        <w:t xml:space="preserve">Feedback: studies show </w:t>
+      </w:r>
+      <w:r>
+        <w:rPr>
+          <w:lang w:val="en-US"/>
+        </w:rPr>
+        <w:t xml:space="preserve">that when random </w:t>
+      </w:r>
+      <w:r>
+        <w:rPr>
+          <w:lang w:val="en-US"/>
+        </w:rPr>
+        <w:t>weights</w:t>
+      </w:r>
+      <w:r>
+        <w:rPr>
+          <w:lang w:val="en-US"/>
+        </w:rPr>
+        <w:t xml:space="preserve"> are assigned ERF is small and it expands significantly as </w:t>
+      </w:r>
+      <w:proofErr w:type="gramStart"/>
+      <w:r>
+        <w:rPr>
+          <w:lang w:val="en-US"/>
+        </w:rPr>
+        <w:t>model reaches</w:t>
+      </w:r>
+      <w:proofErr w:type="gramEnd"/>
+      <w:r>
+        <w:rPr>
+          <w:lang w:val="en-US"/>
+        </w:rPr>
+        <w:t xml:space="preserve"> higher accuracy</w:t>
+      </w:r>
+    </w:p>
+    <w:p>
+      <w:pPr>
+        <w:spacing w:line="240" w:lineRule="auto"/>
+        <w:rPr>
+          <w:lang w:val="en-US"/>
+        </w:rPr>
+      </w:pPr>
+    </w:p>
+    <w:p>
+      <w:pPr>
+        <w:spacing w:line="240" w:lineRule="auto"/>
+        <w:rPr>
+          <w:lang w:val="en-US"/>
+        </w:rPr>
+      </w:pPr>
+      <w:r>
+        <w:rPr>
+          <w:lang w:val="en-US"/>
+        </w:rPr>
+        <w:tab/>
+      </w:r>
+      <w:r>
+        <w:rPr>
+          <w:rStyle w:val="BookTitle"/>
+          <w:lang w:val="en-US"/>
+        </w:rPr>
+        <w:t xml:space="preserve">Answer </w:t>
+      </w:r>
+      <w:r>
+        <w:rPr>
+          <w:rStyle w:val="BookTitle"/>
+          <w:lang w:val="en-US"/>
+        </w:rPr>
+        <w:t>D</w:t>
+      </w:r>
+      <w:proofErr w:type="gramStart"/>
+      <w:r>
+        <w:rPr>
+          <w:rStyle w:val="BookTitle"/>
+          <w:lang w:val="en-US"/>
+        </w:rPr>
+        <w:t>:</w:t>
+      </w:r>
+      <w:r>
+        <w:rPr>
+          <w:lang w:val="en-US"/>
+        </w:rPr>
+        <w:t xml:space="preserve">  [</w:t>
+      </w:r>
+      <w:proofErr w:type="gramEnd"/>
+      <w:r>
+        <w:rPr>
+          <w:lang w:val="en-US"/>
+        </w:rPr>
+        <w:t>incorrect]</w:t>
+      </w:r>
+    </w:p>
+    <w:p>
+      <w:pPr>
+        <w:spacing w:line="240" w:lineRule="auto"/>
+        <w:rPr>
+          <w:lang w:val="en-US"/>
+        </w:rPr>
+      </w:pPr>
+      <w:r>
+        <w:rPr>
+          <w:lang w:val="en-US"/>
+        </w:rPr>
+        <w:tab/>
+      </w:r>
+      <w:r>
+        <w:rPr>
+          <w:lang w:val="en-US"/>
+        </w:rPr>
+        <w:tab/>
+      </w:r>
+      <w:r>
+        <w:rPr>
+          <w:lang w:val="en-US"/>
+        </w:rPr>
+        <w:tab/>
+      </w:r>
+      <w:proofErr w:type="gramStart"/>
+      <w:r>
+        <w:rPr>
+          <w:lang w:val="en-US"/>
+        </w:rPr>
+        <w:t>[ ]</w:t>
+      </w:r>
+      <w:proofErr w:type="gramEnd"/>
+      <w:r>
+        <w:rPr>
+          <w:lang w:val="en-US"/>
+        </w:rPr>
+        <w:t xml:space="preserve"> </w:t>
+      </w:r>
+      <w:r>
+        <w:rPr>
+          <w:lang w:val="en-US"/>
+        </w:rPr>
+        <w:t>???</w:t>
+      </w:r>
+    </w:p>
+    <w:p>
+      <w:pPr>
+        <w:spacing w:line="240" w:lineRule="auto"/>
+        <w:rPr>
+          <w:lang w:val="en-US"/>
+        </w:rPr>
+      </w:pPr>
+      <w:r>
+        <w:rPr>
+          <w:lang w:val="en-US"/>
+        </w:rPr>
+        <w:tab/>
+      </w:r>
+      <w:r>
+        <w:rPr>
+          <w:lang w:val="en-US"/>
+        </w:rPr>
+        <w:tab/>
+      </w:r>
+      <w:r>
+        <w:rPr>
+          <w:lang w:val="en-US"/>
+        </w:rPr>
+        <w:tab/>
         <w:t>Feedback:</w:t>
-      </w:r>
-    </w:p>
-    <w:p>
-      <w:pPr>
-        <w:spacing w:line="240" w:lineRule="auto"/>
-        <w:rPr>
-          <w:lang w:val="en-US"/>
-        </w:rPr>
-      </w:pPr>
-    </w:p>
-    <w:p>
-      <w:pPr>
-        <w:spacing w:line="240" w:lineRule="auto"/>
-        <w:rPr>
-          <w:lang w:val="en-US"/>
-        </w:rPr>
-      </w:pPr>
-      <w:r>
-        <w:rPr>
-          <w:lang w:val="en-US"/>
-        </w:rPr>
-        <w:tab/>
-      </w:r>
-      <w:r>
-        <w:rPr>
-          <w:rStyle w:val="BookTitle"/>
-          <w:lang w:val="en-US"/>
-        </w:rPr>
-        <w:t xml:space="preserve">Answer </w:t>
-      </w:r>
-      <w:r>
-        <w:rPr>
-          <w:rStyle w:val="BookTitle"/>
-          <w:lang w:val="en-US"/>
-        </w:rPr>
-        <w:t>C</w:t>
-      </w:r>
-      <w:proofErr w:type="gramStart"/>
-      <w:r>
-        <w:rPr>
-          <w:rStyle w:val="BookTitle"/>
-          <w:lang w:val="en-US"/>
-        </w:rPr>
-        <w:t>:</w:t>
-      </w:r>
-      <w:r>
-        <w:rPr>
-          <w:lang w:val="en-US"/>
-        </w:rPr>
-        <w:t xml:space="preserve">  [</w:t>
-      </w:r>
-      <w:proofErr w:type="gramEnd"/>
-      <w:r>
-        <w:rPr>
-          <w:lang w:val="en-US"/>
-        </w:rPr>
-        <w:t>correct]</w:t>
-      </w:r>
-    </w:p>
-    <w:p>
-      <w:pPr>
-        <w:spacing w:line="240" w:lineRule="auto"/>
-        <w:rPr>
-          <w:lang w:val="en-US"/>
-        </w:rPr>
-      </w:pPr>
-      <w:r>
-        <w:rPr>
-          <w:lang w:val="en-US"/>
-        </w:rPr>
-        <w:tab/>
-      </w:r>
-      <w:r>
-        <w:rPr>
-          <w:lang w:val="en-US"/>
-        </w:rPr>
-        <w:tab/>
-      </w:r>
-      <w:r>
-        <w:rPr>
-          <w:lang w:val="en-US"/>
-        </w:rPr>
-        <w:tab/>
-      </w:r>
-      <w:proofErr w:type="gramStart"/>
-      <w:r>
-        <w:rPr>
-          <w:lang w:val="en-US"/>
-        </w:rPr>
-        <w:t>[ ]</w:t>
-      </w:r>
-      <w:proofErr w:type="gramEnd"/>
-      <w:r>
-        <w:rPr>
-          <w:lang w:val="en-US"/>
-        </w:rPr>
-        <w:t xml:space="preserve"> ERF typical starts small and grows during the learning cycles</w:t>
-      </w:r>
-    </w:p>
-    <w:p>
-      <w:pPr>
-        <w:spacing w:line="240" w:lineRule="auto"/>
-        <w:rPr>
-          <w:lang w:val="en-US"/>
-        </w:rPr>
-      </w:pPr>
-      <w:r>
-        <w:rPr>
-          <w:lang w:val="en-US"/>
-        </w:rPr>
-        <w:tab/>
-      </w:r>
-      <w:r>
-        <w:rPr>
-          <w:lang w:val="en-US"/>
-        </w:rPr>
-        <w:tab/>
-      </w:r>
-      <w:r>
-        <w:rPr>
-          <w:lang w:val="en-US"/>
-        </w:rPr>
-        <w:tab/>
-        <w:t xml:space="preserve">Feedback: studies show </w:t>
-      </w:r>
-      <w:r>
-        <w:rPr>
-          <w:lang w:val="en-US"/>
-        </w:rPr>
-        <w:t xml:space="preserve">that when random </w:t>
-      </w:r>
-      <w:r>
-        <w:rPr>
-          <w:lang w:val="en-US"/>
-        </w:rPr>
-        <w:t>weights</w:t>
-      </w:r>
-      <w:r>
-        <w:rPr>
-          <w:lang w:val="en-US"/>
-        </w:rPr>
-        <w:t xml:space="preserve"> are assigned ERF is small and it expands significantly as </w:t>
-      </w:r>
-      <w:proofErr w:type="gramStart"/>
-      <w:r>
-        <w:rPr>
-          <w:lang w:val="en-US"/>
-        </w:rPr>
-        <w:t>model reaches</w:t>
-      </w:r>
-      <w:proofErr w:type="gramEnd"/>
-      <w:r>
-        <w:rPr>
-          <w:lang w:val="en-US"/>
-        </w:rPr>
-        <w:t xml:space="preserve"> higher accuracy</w:t>
       </w:r>
     </w:p>
     <w:p>

</xml_diff>